<commit_message>
fix(plan-pizzeria): revisión final aplicada (1 B · 8 M · 15 m) — gates F2 en verde
B1 Instrucciones ya no manda el coste de una pizza a Supuestos!B13 · M1 {PAYBACK} legible con cualquier valor ·
M2 «con azúcares o edulcorantes añadidos» (LIVA 91.Uno.1.1.º b) · M3-M8 coherencia calculadora/Excel/Word/landing ·
guarda RX_PUBLICA contra la trampa de motor.TILDES. Detalle en plan-pizzeria/REVISION-FINAL.md.

Via: Claude Code

Co-Authored-By: Claude Opus 5.5 <noreply@anthropic.com>
</commit_message>
<xml_diff>
--- a/astro-site/public/dl/plan-negocio-pizzeria/plan-de-negocio-pizzeria.docx
+++ b/astro-site/public/dl/plan-negocio-pizzeria/plan-de-negocio-pizzeria.docx
@@ -320,22 +320,22 @@
     </w:p>
     <w:p>
       <w:r>
-        <w:t>Las cifras clave del caso son estas. Una media de 66 comensales al día, entre sala, para llevar y domicilio, a 19,50 € por comensal sin IVA, durante 300 días de apertura, que dan unas ventas de 386.100 € en el primer año y un resultado neto de 32.996 €, un 8,5 % de las ventas. Esa media incluye la rampa de arranque: el Excel reparte el año mes a mes y el Mes 1 es septiembre. El equilibrio contable está en 57 comensales al día y el de caja, que además cubre las cuotas del préstamo, en 54 durante el primer año, el de carencia. No es una rentabilidad garantizada: es un punto de partida para que cambies las hipótesis y pongas tus propios números.</w:t>
+        <w:t>Las cifras clave del caso son estas. Una media de 66 comensales al día, entre sala, para llevar y domicilio, a 19,50 € por comensal sin IVA, durante 300 días de apertura, que dan unas ventas de 386.100 € en el primer año y un resultado neto de 32.996 €, un 8,5 % de las ventas. Esa media incluye la rampa de arranque: el Excel reparte el año mes a mes y el Mes 1 es septiembre. El equilibrio contable está en 57 comensales al día y el de caja, que además cubre la devolución del principal (ninguna el primer año, el de carencia), en 54 ese primer año. No es una rentabilidad garantizada: es un punto de partida para que cambies las hipótesis y pongas tus propios números.</w:t>
       </w:r>
     </w:p>
     <w:p>
       <w:r>
-        <w:t>La inversión total es de 194.953 €: 130.250 € de obra, horno, equipo y puesta en marcha, 6.300 € de fianza y 6.300 € de renta previa, que suman 142.850 € de inversión sin el fondo, y 52.103 € de fondo de maniobra. A eso se suma el IVA de la inversión, 27.940 €, que se adelanta y se recupera con las declaraciones de IVA, así que la necesidad de caja llega a 222.894 €. Se financia con 65.000 € de recursos propios y un préstamo de 159.000 € a 7 años, con 1 año de carencia de principal y un tipo del 6 %. Los fondos suman 224.000 € y sobran 1.106 €. La cuota anual, ya sin carencia, es de 32.335 €.</w:t>
+        <w:t>La inversión total es de 194.953 €: 130.250 € de obra, horno, equipo y puesta en marcha, 6.300 € de fianza y 6.300 € de renta previa, que suman 142.850 € de inversión sin el fondo, y 52.103 € de fondo de maniobra. A eso se suma el IVA de la inversión, 27.941 €, que se adelanta y se recupera con las declaraciones de IVA, así que la necesidad de caja llega a 222.894 €. Se financia con 65.000 € de recursos propios y un préstamo de 159.000 € a 7 años, con 1 año de carencia de principal y un tipo del 6 %. Los fondos suman 224.000 € y sobran 1.106 €. La cuota anual, ya sin carencia, es de 32.335 €.</w:t>
       </w:r>
     </w:p>
     <w:p>
       <w:r>
-        <w:t>El primer año factura 386.100 € y deja un resultado neto de 32.996 €, un 8,5 % de las ventas. Los comensales crecen un 6 % en el segundo año y un 4 % en el tercero, con el mismo ticket: las ventas pasan a 409.266 € y 425.637 €, y el neto, a 41.103 € y 41.028 €. La holgura de caja sobre el equilibrio es de 24,3 % el primer año, pero porque hay carencia. En el segundo baja a 15,7 %, porque empieza a devolverse el principal, y en el tercero es de 17,4 %. Son los años que hay que vigilar. La inversión se recupera en el plazo que indica Más de 3 años.</w:t>
+        <w:t>El primer año factura 386.100 € y deja un resultado neto de 32.996 €, un 8,5 % de las ventas. Los comensales crecen un 6 % en el segundo año y un 4 % en el tercero, con el mismo ticket: las ventas pasan a 409.266 € y 425.637 €, y el neto, a 41.103 € y 41.028 €. La holgura de caja sobre el equilibrio es de 24,3 % el primer año, pero porque hay carencia. En el segundo baja a 15,7 %, porque empieza a devolverse el principal, y en el tercero es de 17,4 %. Son los años que hay que vigilar. El payback antes de la deuda, en años, sale en la Tesorería del Excel: «Más de 3 años» con el fondo de maniobra dentro y «2,4» sin él.</w:t>
       </w:r>
     </w:p>
     <w:p>
       <w:r>
-        <w:t>El equipo es corto y se apoya en ti. Eres el pizzaiolo jefe y llevas el horno y la masa cada día. Te acompañan un segundo pizzaiolo, un ayudante, la sala en dos servicios y un refuerzo de fin de semana, en una plantilla de 7 personas que suman 4,97 jornadas completas. El kit incluye este plan de negocio de diez secciones, el Excel del plan financiero de nueve hojas, el checklist de apertura de 80 tareas en seis fases, la calculadora de masa y escandallo, y la guía de equivalencias para Latinoamérica.</w:t>
+        <w:t>El equipo es corto y se apoya en ti. Eres el pizzaiolo jefe y llevas el horno y la masa cada día. Te acompañan un segundo pizzaiolo, un ayudante, la sala en dos servicios y un refuerzo de fin de semana, en una plantilla de 7 personas que suman 4,98 jornadas completas. El kit incluye este plan de negocio de diez secciones, el Excel del plan financiero de nueve hojas, el checklist de apertura de 80 tareas en seis fases, la calculadora de masa y escandallo, y la guía de equivalencias para Latinoamérica.</w:t>
       </w:r>
     </w:p>
     <w:p>
@@ -362,12 +362,12 @@
     </w:p>
     <w:p>
       <w:r>
-        <w:t>La propuesta de valor es una masa de fermentación larga hecha cada día y un horno de leña a la vista, que el cliente ve trabajar desde su mesa. La carta es corta, de 14 a 16 pizzas, con producto italiano y entrantes de inspiración napolitana como la frittatina, la montanarina o la burrata, y tres postres caseros. La masa manda: pesas la harina, la sal y la levadura por litro de agua, amasas despacio, dejas fermentar en bloque y después en bolas, y la estiras a mano, sin rodillo. La leña tiene un sentido práctico además del sabor: da un horno muy caliente y una pizza lista en pocos segundos. Los alérgenos van resueltos en la carta y en la sala.</w:t>
+        <w:t>La propuesta de valor es una masa de fermentación larga hecha cada día y un horno de leña a la vista, que el cliente ve trabajar desde su mesa. La carta es corta, de 14 a 16 pizzas, con producto italiano y entrantes de inspiración napolitana como la frittatina, la montanarina o la burrata, y tres postres caseros. La masa manda: pesas la harina, la sal y la levadura por litro de agua, amasas despacio, dejas fermentar en bloque y después en bolas, y la estiras a mano, sin rodillo. La leña tiene un sentido práctico además del sabor: da un horno muy caliente y una pizza lista en 60-90 segundos. Los alérgenos van resueltos en la carta y en la sala.</w:t>
       </w:r>
     </w:p>
     <w:p>
       <w:r>
-        <w:t>La carta del caso, con IVA, va de 9,50 a 15,50 € la pizza, y la Margherita cuesta 10 €. Las recetas se llaman por su nombre: Margherita, Marinara, Diavola, Capricciosa. Se completa con cinco entrantes y tres postres. La mediana de la Margherita en catorce pizzerías españolas, en octubre de 2026, es de 10,90 €, así que el caso se sitúa en la franja media. Para llevar hay dos vías: la recogida en el local, sin comisión, y la plataforma con su reparto, con techo. No hay reparto propio.</w:t>
+        <w:t>La carta del caso, con IVA, va de 9,50 a 15,50 € la pizza, y la Margherita cuesta 10 €. Las recetas se llaman por su nombre: Margherita, Marinara, Diavola, Capricciosa. Se completa con cinco entrantes y tres postres. La mediana de la Margherita en catorce pizzerías españolas, en octubre de 2026, es de 10,90 €, así que el caso queda algo por debajo de la mediana. Para llevar hay dos vías: la recogida en el local, sin comisión, y la plataforma con su reparto, con techo. No hay reparto propio.</w:t>
       </w:r>
     </w:p>
     <w:p>
@@ -409,7 +409,7 @@
     </w:p>
     <w:p>
       <w:r>
-        <w:t>Sobre precios, la Margherita en carta, con IVA, tiene una mediana de 10,90 € en catorce pizzerías de Madrid, Barcelona, Valencia, Marbella y Tenerife, según una revisión de octubre de 2026. En carta propia, el rango es de 10,50 a 12,90 € en Madrid y Barcelona, y de 8 a 9 € en Canarias. El caso, con la Margherita a 10 €, entra en la parte media del mercado. Mira las cartas de tu zona antes de fijar la tuya: la mediana es una referencia, no una norma, y tu barrio puede pagar más o menos.</w:t>
+        <w:t>Sobre precios, la Margherita en carta, con IVA, tiene una mediana de 10,90 € en catorce pizzerías de Madrid, Barcelona, Valencia, Marbella y Tenerife, según una revisión de octubre de 2026. En carta propia, el rango es de 10,50 a 12,90 € en Madrid y Barcelona, y de 8 a 9 € en Canarias. El caso, con la Margherita a 10 €, queda algo por debajo de la mediana: precio de barrio, no de pizzería de autor. Mira las cartas de tu zona antes de fijar la tuya: la mediana es una referencia, no una norma, y tu barrio puede pagar más o menos.</w:t>
       </w:r>
     </w:p>
     <w:p>
@@ -545,12 +545,12 @@
     </w:p>
     <w:p>
       <w:r>
-        <w:t>La masa manda en esta pizzería y su receta se escribe con cifras, no con frases. Como referencia tomamos el pliego de la ETG «Pizza Napoletana» (Reglamento (UE) 97/2010), que parte de 1 litro de agua: 1.800 g de harina de trigo tierno (W 220-380, proteína del 11-12,5 %), 50-55 g de sal y 3 g de levadura de cerveza, es decir, un 55,6 % de hidratación, ≈ 2,9 % de sal y 0,17 % de levadura sobre la harina. Se incorporan los ingredientes durante 10 minutos y se amasa despacio otros 20; sigue una primera fermentación en bloque de 2 horas, se hacen a mano bolas de 180-250 g y se dejan 4-6 horas más a temperatura ambiente, unos 25 °C, para usarlas en las 6 horas siguientes. Todo en ciclo continuo, sin frío, biga ni poolish. Después, disco de 35 cm como máximo, centro de 0,4 cm y cornisa («cornicione») de 1-2 cm, sin rodillo ni prensa, y 60-90 segundos sobre una solera de unos 485 °C con la bóveda a unos 430 °C. De 1 kg de harina salen unos 1.586 g de masa: 6 bolas de 250 g o 8 de 200 g. La masa de muchas pizzerías españolas (biga o poolish, 60-75 % de hidratación, 24-72 horas en frío) es buena masa, pero queda fuera de ese pliego. La calculadora hace las dos cuentas: cada bola cuesta 0,23 € y la Margherita de ejemplo, 1,32 €, un 15 % de food cost; con búfala, burrata o embutido italiano, más.</w:t>
+        <w:t>La masa manda en esta pizzería y su receta se escribe con cifras, no con frases. Como referencia tomamos el pliego de la ETG «Pizza Napoletana» (Reglamento (UE) 97/2010), que parte de 1 litro de agua: 1.800 g de harina de trigo tierno (W 220-380, proteína del 11-12,5 %), 50-55 g de sal y 3 g de levadura de cerveza, es decir, un 55,6 % de hidratación, ≈ 2,9 % de sal y 0,17 % de levadura sobre la harina. Se incorporan los ingredientes durante 10 minutos y se amasa despacio otros 20; sigue una primera fermentación en bloque de 2 horas, se hacen a mano bolas de 180-250 g y se dejan 4-6 horas más a temperatura ambiente, unos 25 °C, para usarlas en las 6 horas siguientes. Todo en ciclo continuo, sin frío, biga ni poolish. Después, disco de 35 cm como máximo, centro de 0,4 cm y cornisa («cornicione») de 1-2 cm, sin rodillo ni prensa, y 60-90 segundos sobre una solera de unos 485 °C con la bóveda a unos 430 °C. De 1 kg de harina salen unos 1.586 g de masa: 6 bolas de 250 g o casi 8 de 200 g. La masa de muchas pizzerías españolas (biga o poolish, 60-75 % de hidratación, 24-72 horas en frío) es buena masa, pero queda fuera de ese pliego. La calculadora tiene las dos entradas, la del pliego (gramos por litro de agua) y la del porcentaje panadero (hidratación, sal y levadura sobre la harina), sin prefermentos ni tiempos de fermentación, que fija tu receta. Con los precios del kit, cada bola cuesta 0,23 € y la Margherita de ejemplo, 1,32 €, un 15 % de food cost; con búfala, burrata o embutido italiano, más.</w:t>
       </w:r>
     </w:p>
     <w:p>
       <w:r>
-        <w:t>El horno es la decisión grande, y conviene tomarla antes de firmar el local. El del caso es de leña, de 120-130 cm: 9.000 €. Los prefabricados profesionales con precio publicado van de 2.750 a 5.505 €; los artesanos napolitanos no publican tarifa, así que pide oferta con el montaje. Suma la chimenea hasta cubierta con filtro de partículas, 9.000 €, y la leña, que es un coste fijo: 3.600 € al año, con unos 5 kg por hora de fuego, 11 horas al día, 300 días y unos 0,22 € el kg. Se quema por hora encendido, no por pizza, y tiene que ser leña seca y sin tratar (encina, roble, haya u olivo). El horno de gas pide instalación por empresa habilitada y revisión cada 5 años, y su consumo también es fijo. Un eléctrico napolitano de seis pizzas cuesta unos 13.140 € sin IVA, llega a 515 °C y pide 16,4 kW en trifásica; tampoco te libra de la campana extractora ni del conducto para los vahos.</w:t>
+        <w:t>El horno es la decisión grande, y conviene tomarla antes de firmar el local. El del caso es de leña, de 120-130 cm: 9.000 €. Los prefabricados profesionales con precio publicado van de 2.750 a 5.505 €; los artesanos napolitanos no publican tarifa, así que pide oferta con el montaje. Suma la chimenea hasta cubierta con filtro de partículas, 9.000 €, y la leña, que es un coste fijo: 3.600 € al año, con unos 5 kg por hora de fuego, 11 horas al día, 300 días y unos 0,22 € el kg. Se quema por hora encendido, no por pizza, y tiene que ser leña seca y sin tratar (encina, roble, haya u olivo). El horno de gas pide instalación por empresa habilitada y revisión cada 5 años, y su consumo también es fijo. Un eléctrico de alta temperatura para seis pizzas (el modelo «Napolitano» de un fabricante italiano) cuesta unos 13.140 € sin IVA, llega a 515 °C y pide 16,4 kW en trifásica; tampoco te libra de la campana extractora ni del conducto para los vahos.</w:t>
       </w:r>
     </w:p>
     <w:p>
@@ -592,7 +592,7 @@
     </w:p>
     <w:p>
       <w:r>
-        <w:t>Con las suplencias de vacaciones y descansos, el cuadro suma 7 personas, equivalentes a 4,97 jornadas completas, y cuesta 139.873 € el primer año, el 36,2 % de las ventas. Es el mayor gasto del negocio, por encima del alquiler. El cuadrante contrata 9.154 horas frente a las 8.775 necesarias, una cobertura del 104 %: ajustada, sin mucho margen para bajas. El refuerzo hace sala, terraza, recogida y la tablet de las plataformas, sin reparto propio, y el sábado por la noche hacen falta unas cinco personas, con el refuerzo y el camarero de cenas dentro. La plantilla crece con personas, no con un porcentaje: 6.000 € de incorporaciones el segundo año y otro tanto el tercero.</w:t>
+        <w:t>Con las suplencias de vacaciones y descansos, el cuadro suma 7 personas, equivalentes a 4,98 jornadas completas, y cuesta 139.873 € el primer año, el 36,2 % de las ventas. Es el mayor gasto del negocio, por encima del alquiler. El cuadrante contrata 9.154 horas frente a las 8.775 necesarias, una cobertura del 104 %: ajustada, sin mucho margen para bajas. El refuerzo hace sala, terraza, recogida y la tablet de las plataformas, sin reparto propio, y el sábado por la noche hacen falta unas cinco personas, con el refuerzo y el camarero de cenas dentro. La plantilla crece con personas, no con un porcentaje: 6.000 € de incorporaciones el segundo año y otro tanto el tercero.</w:t>
       </w:r>
     </w:p>
     <w:p>
@@ -634,17 +634,17 @@
     </w:p>
     <w:p>
       <w:r>
-        <w:t>Para abrir necesitas 194.953 €. Son 130.250 € de obra, horno, equipo y puesta en marcha, 6.300 € de fianza y 6.300 € de renta antes de abrir, que suman 142.850 € de inversión sin el fondo, más 52.103 € de fondo de maniobra. El IVA de la inversión, 27.940 €, lo adelantas, así que la necesidad de caja llega a 222.894 €; cómo recuperarlo, confírmalo con tu gestoría. Se financia con 65.000 € propios y un préstamo de 159.000 € al 6 %, a 7 años con 1 año de carencia y una cuota anual de 32.335 €.</w:t>
+        <w:t>Para abrir necesitas 194.953 €. Son 130.250 € de obra, horno, equipo y puesta en marcha, 6.300 € de fianza y 6.300 € de renta antes de abrir, que suman 142.850 € de inversión sin el fondo, más 52.103 € de fondo de maniobra. El IVA de la inversión, 27.941 €, lo adelantas, así que la necesidad de caja llega a 222.894 €; cómo recuperarlo, confírmalo con tu gestoría. Se financia con 65.000 € propios y un préstamo de 159.000 € al 6 %, a 7 años con 1 año de carencia y una cuota anual de 32.335 €.</w:t>
       </w:r>
     </w:p>
     <w:p>
       <w:r>
-        <w:t>La cuenta de resultados a tres años proyecta unas ventas de 386.100 €, 409.266 € y 425.637 €. El margen bruto del primer año es del 67,1 %, después de todos los costes variables: mercancía (el 24,1 % de las ventas), cajas y envases, plataforma, medios de pago y varios. El personal suma 139.873 €, el alquiler 25.200 € (un 6,5 % de las ventas), la leña 3.600 € y la tasa de terraza y residuos 1.800 €, que es orientativa: pon la de tu ayuntamiento. El resultado de explotación antes de amortizaciones e intereses es de 60.084 €, un 15,6 % de las ventas. El resultado neto es de 32.996 €, 41.103 € y 41.028 €, es decir, un 8,5 %, un 10,0 % y un 9,6 %; en el tercer año el plan ya aplica el tipo general del Impuesto de Sociedades. Es una cifra honesta: una pizzería de barrio bien llevada deja en torno a un 9 % neto, y las rentabilidades mucho más altas que circulan por internet no se sostienen con una plantilla legal.</w:t>
+        <w:t>La cuenta de resultados a tres años proyecta unas ventas de 386.100 €, 409.266 € y 425.637 €. El margen bruto del primer año es del 67,1 %, después de todos los costes variables: mercancía (el 24,1 % de las ventas), cajas y envases, plataforma, medios de pago y varios. El personal suma 139.873 €, el alquiler 25.200 € (un 6,5 % de las ventas), la leña 3.600 € y la tasa de terraza y residuos 1.800 €, que es orientativa: pon la de tu ayuntamiento. El resultado de explotación antes de amortizaciones e intereses es de 60.084 €, un 15,6 % de las ventas. El resultado neto es de 32.996 €, 41.103 € y 41.028 €, es decir, un 8,5 %, un 10,0 % y un 9,6 %; en el tercer año el plan ya aplica el tipo general del Impuesto de Sociedades (25 %); si tu cifra de negocios queda por debajo de 1 M € o de 10 M €, desde 2025 hay tipos más bajos que se implantan de forma gradual: confírmalo con tu asesor. Es una cifra honesta: una pizzería de barrio bien llevada deja en torno a un 9 % neto, y las rentabilidades mucho más altas que circulan por internet no se sostienen con una plantilla legal.</w:t>
       </w:r>
     </w:p>
     <w:p>
       <w:r>
-        <w:t>El crecimiento es el que hace el Excel: suben los comensales un 6 % el segundo año y un 4 % el tercero, de 66 a 70 y 73 al día, con el mismo ticket de 19,50 € sin IVA, y la plantilla crece con personas (6.000 € al año), no con un porcentaje. En el IVA, la comida va al 10 % en sala, para llevar y a domicilio. De la bebida, la parte que sale del local con alcohol o con azúcares añadidos, el 7 % de la bebida, va al 21 %, y el resto al 10 %; el IVA medio de la bebida queda en 10,8 %.</w:t>
+        <w:t>El crecimiento es el que hace el Excel: suben los comensales un 6 % el segundo año y un 4 % el tercero, de 66 a 70 y 73 al día, con el mismo ticket de 19,50 € sin IVA, y la plantilla crece con personas (6.000 € al año), no con un porcentaje. En el IVA, la comida va al 10 % en sala, para llevar y a domicilio. De la bebida, la parte que sale del local con alcohol o con azúcares o edulcorantes añadidos, el 7 % de la bebida, va al 21 %, y el resto al 10 %; el IVA medio de la bebida queda en 10,8 %.</w:t>
       </w:r>
     </w:p>
     <w:p>
@@ -659,7 +659,7 @@
     </w:p>
     <w:p>
       <w:r>
-        <w:t>El DSCR mínimo es de 1,88, con 1,93 en el segundo año y 1,88 en el tercero: el negocio cubre la deuda, pero sin mucho colchón, y el banco querrá ver tu plan de ventas. Sobre el payback del proyecto, la respuesta es: Más de 3 años. No es una inversión de recuperación rápida, sino un negocio de oficio que te paga 1.900 € brutos al mes y devuelve el capital con paciencia.</w:t>
+        <w:t>El DSCR mínimo es de 1,88, con 1,93 en el segundo año y 1,88 en el tercero: el negocio cubre la deuda con margen sobre el 1,25 que suele pedir un banco, que aun así querrá ver tu plan de ventas. El payback, en años y antes de la deuda, es «Más de 3 años» con el fondo de maniobra dentro y «2,4» sin él. No es una inversión de recuperación rápida, sino un negocio de oficio que te paga 1.900 € brutos al mes y devuelve el capital con paciencia.</w:t>
       </w:r>
     </w:p>
     <w:p>
@@ -696,7 +696,7 @@
     </w:p>
     <w:p>
       <w:r>
-        <w:t>El gas lo instala una empresa habilitada y se controla cada 5 años (RD 919/2006). En sanidad presentas una declaración responsable ante el registro sanitario de tu comunidad autónoma (RD 1021/2022); el RGSEAA solo aplica si suministras a otros negocios por encima de lo que permite el art. 3 de ese real decreto. Tu APPCC se apoya en el Reglamento (CE) 852/2004 y en la flexibilidad del art. 20 del RD 1021/2022. La temperatura de los quesos, los embutidos y las masas la marca la etiqueta del fabricante (art. 4.2), y lo que sale del local viaja en medios que mantengan la temperatura (art. 4.3).</w:t>
+        <w:t>El gas lo instala una empresa habilitada y se controla cada 5 años (RD 919/2006). En sanidad presentas una declaración responsable ante el registro sanitario de tu comunidad autónoma (RD 1021/2022); el RGSEAA solo aplica si suministras a otros negocios por encima de lo que permite el art. 3 de ese real decreto. Tu APPCC se apoya en el Reglamento (CE) 852/2004 y en la flexibilidad del art. 20 del RD 1021/2022. La temperatura de los quesos y los embutidos la marca la etiqueta del fabricante (art. 4.2); la de tus bolas de masa, sin etiqueta, tu APPCC (con el pliego, 4-6 horas a temperatura ambiente y uso en las 6 siguientes; en frío, la que fijes y compruebes), y lo que sale del local viaja en medios que mantengan la temperatura (art. 4.3).</w:t>
       </w:r>
     </w:p>
     <w:p>
@@ -711,12 +711,12 @@
     </w:p>
     <w:p>
       <w:r>
-        <w:t>Solo puede llamarse «pizza napolitana» (o «napoletana») la que cumple el pliego (Reglamento (UE) 97/2010: horno de leña, masa del día a temperatura ambiente, estirado a mano y mozzarella de búfala campana DOP o «Mozzarella» ETG) y ha pasado la verificación oficial previa (arts. 72-73): comunicación a la autoridad, autocontrol y verificación por la autoridad o un organismo delegado acreditado. La AVPN es una asociación privada y su certificación no sustituye esa verificación. Quién la hace en España y cuánto cuesta, pregúntalo en tu comunidad autónoma. «Estilo napolitano» en el rótulo es zona gris: consúltalo antes.</w:t>
+        <w:t>Solo puede llamarse «pizza napolitana» (o «napoletana») la que cumple el pliego (Reglamento (UE) 97/2010: horno de leña, masa del día a temperatura ambiente, estirado a mano y, si lleva queso, «Mozzarella di Bufala Campana» DOP o «Mozzarella» ETG) y ha pasado la verificación oficial previa (arts. 72-73): comunicación a la autoridad, autocontrol y verificación por la autoridad o un organismo delegado acreditado. La AVPN es una asociación privada y su certificación no sustituye esa verificación. Quién la hace en España y cuánto cuesta, pregúntalo en tu comunidad autónoma. «Estilo napolitano» en el rótulo es zona gris: consúltalo antes.</w:t>
       </w:r>
     </w:p>
     <w:p>
       <w:r>
-        <w:t>En el IVA (Ley 37/1992, art. 91), la comida va al 10 % en sala, para llevar y a domicilio; la cerveza, el vino y los refrescos con azúcares añadidos que salen del local tributan al 21 %, y en sala todo va al 10 %. En personal aplican el convenio provincial de hostelería (ALEH VI, art. 4), el SMI de 2026 (Real Decreto 126/2026) y los arts. 1.1, 6 y 34.9 y la disposición adicional 23.ª del Estatuto de los Trabajadores. La facturación se hace con software Veri*factu: consulta con tu gestoría la fecha que te aplica. Esta sección recoge lo que podemos afirmar; para todo lo demás, compruébalo con tu gestor, tu ayuntamiento o el inspector antes de decidir.</w:t>
+        <w:t>En el IVA (Ley 37/1992, art. 91), la comida va al 10 % en sala, para llevar y a domicilio; la cerveza, el vino y los refrescos con azúcares o edulcorantes añadidos que salen del local tributan al 21 %; en sala, todo al 10 %. En personal aplican el convenio provincial de hostelería (ALEH VI, art. 4), el SMI de 2026 (Real Decreto 126/2026) y los arts. 1.1, 6 y 34.9 y la disposición adicional 23.ª del Estatuto de los Trabajadores. La facturación se hace con software Veri*factu: consulta con tu gestoría la fecha que te aplica. Esta sección recoge lo que podemos afirmar; para todo lo demás, compruébalo con tu gestor, tu ayuntamiento o el inspector antes de decidir.</w:t>
       </w:r>
     </w:p>
     <w:p>
@@ -738,7 +738,7 @@
     </w:p>
     <w:p>
       <w:r>
-        <w:t>La conclusión es que una pizzería de este tamaño es viable, pero exigente. Con 66 comensales al día a 19,50 € por comensal, sin IVA, el primer año deja un neto de 32.996 € y una holgura de caja del 24,3 %. Pero esa holgura baja al 15,7 % en el segundo año y al 17,4 % en el tercero, cuando ya devuelves el principal. El DSCR mínimo es de 1,88, el saldo mínimo de caja es de 61.519 € en septiembre y, sobre el payback, la respuesta es: Más de 3 años. No es un negocio para ir con el capital justo.</w:t>
+        <w:t>La conclusión es que una pizzería de este tamaño es viable, pero exigente. Con 66 comensales al día a 19,50 € por comensal, sin IVA, el primer año deja un neto de 32.996 € y una holgura de caja del 24,3 %. Pero esa holgura baja al 15,7 % en el segundo año y al 17,4 % en el tercero, cuando ya devuelves el principal. El DSCR mínimo es de 1,88, el saldo mínimo de caja es de 61.519 € en septiembre y el payback, en años y antes de la deuda, es «Más de 3 años». No es un negocio para ir con el capital justo.</w:t>
       </w:r>
     </w:p>
     <w:p>

</xml_diff>